<commit_message>
wip: scoring improvements complete, requirement fields populated
</commit_message>
<xml_diff>
--- a/backend/uploads/trialCV1.docx
+++ b/backend/uploads/trialCV1.docx
@@ -5,35 +5,6 @@
     <w:p>
       <w:pPr>
         <w:spacing w:before="100" w:beforeAutospacing="1" w:after="100" w:afterAutospacing="1" w:line="240" w:lineRule="auto"/>
-        <w:outlineLvl w:val="0"/>
-        <w:rPr>
-          <w:rFonts w:ascii="Times New Roman" w:eastAsia="Times New Roman" w:hAnsi="Times New Roman" w:cs="Times New Roman"/>
-          <w:b/>
-          <w:bCs/>
-          <w:kern w:val="36"/>
-          <w:sz w:val="48"/>
-          <w:szCs w:val="48"/>
-          <w:lang w:val="en-US"/>
-          <w14:ligatures w14:val="none"/>
-        </w:rPr>
-      </w:pPr>
-      <w:r>
-        <w:rPr>
-          <w:rFonts w:ascii="Times New Roman" w:eastAsia="Times New Roman" w:hAnsi="Times New Roman" w:cs="Times New Roman"/>
-          <w:b/>
-          <w:bCs/>
-          <w:kern w:val="36"/>
-          <w:sz w:val="48"/>
-          <w:szCs w:val="48"/>
-          <w:lang w:val="en-US"/>
-          <w14:ligatures w14:val="none"/>
-        </w:rPr>
-        <w:t>CV 1 – Kofi Asante (Backend Engineer)</w:t>
-      </w:r>
-    </w:p>
-    <w:p>
-      <w:pPr>
-        <w:spacing w:before="100" w:beforeAutospacing="1" w:after="100" w:afterAutospacing="1" w:line="240" w:lineRule="auto"/>
         <w:rPr>
           <w:rFonts w:ascii="Times New Roman" w:eastAsia="Times New Roman" w:hAnsi="Times New Roman" w:cs="Times New Roman"/>
           <w:kern w:val="0"/>
@@ -755,7 +726,6 @@
           <w:lang w:val="en-US"/>
           <w14:ligatures w14:val="none"/>
         </w:rPr>
-        <w:lastRenderedPageBreak/>
         <w:t>Cloud &amp; DevOps</w:t>
       </w:r>
     </w:p>
@@ -780,6 +750,7 @@
           <w:lang w:val="en-US"/>
           <w14:ligatures w14:val="none"/>
         </w:rPr>
+        <w:lastRenderedPageBreak/>
         <w:t xml:space="preserve">Docker </w:t>
       </w:r>
     </w:p>
@@ -1497,7 +1468,6 @@
           <w:lang w:val="en-US"/>
           <w14:ligatures w14:val="none"/>
         </w:rPr>
-        <w:lastRenderedPageBreak/>
         <w:t>Projects</w:t>
       </w:r>
     </w:p>
@@ -1527,6 +1497,7 @@
           <w:lang w:val="en-US"/>
           <w14:ligatures w14:val="none"/>
         </w:rPr>
+        <w:lastRenderedPageBreak/>
         <w:t>Inventory Management System</w:t>
       </w:r>
     </w:p>

</xml_diff>